<commit_message>
Add JD AI Solutions LLC to resume
</commit_message>
<xml_diff>
--- a/Johnathan_York_Resume.docx
+++ b/Johnathan_York_Resume.docx
@@ -232,6 +232,68 @@
           <w:sz w:val="28"/>
         </w:rPr>
         <w:t>PROFESSIONAL EXPERIENCE</w:t>
+      </w:r>
+    </w:p>
+    <w:p>
+      <w:pPr>
+        <w:spacing w:after="40"/>
+      </w:pPr>
+      <w:r>
+        <w:rPr>
+          <w:b/>
+          <w:sz w:val="22"/>
+        </w:rPr>
+        <w:t xml:space="preserve">JD AI SOLUTIONS LLC </w:t>
+      </w:r>
+      <w:r>
+        <w:rPr>
+          <w:sz w:val="22"/>
+        </w:rPr>
+        <w:t>| Maryland, USA</w:t>
+      </w:r>
+    </w:p>
+    <w:p>
+      <w:pPr>
+        <w:spacing w:after="80"/>
+      </w:pPr>
+      <w:r>
+        <w:rPr>
+          <w:i/>
+          <w:sz w:val="22"/>
+        </w:rPr>
+        <w:t>Founder &amp; Principal Consultant</w:t>
+      </w:r>
+      <w:r>
+        <w:rPr>
+          <w:sz w:val="22"/>
+        </w:rPr>
+        <w:t xml:space="preserve"> (2026 - Present)</w:t>
+      </w:r>
+    </w:p>
+    <w:p>
+      <w:pPr>
+        <w:pStyle w:val="ListBullet"/>
+        <w:spacing w:after="80"/>
+        <w:ind w:left="360"/>
+      </w:pPr>
+      <w:r>
+        <w:rPr>
+          <w:sz w:val="21"/>
+        </w:rPr>
+        <w:t>Founded and launched an official LLC licensed in the State of Maryland, providing expert-level consulting in AI integration, cognitive workflow automations, and capital project management.</w:t>
+      </w:r>
+    </w:p>
+    <w:p>
+      <w:pPr>
+        <w:pStyle w:val="ListBullet"/>
+        <w:spacing w:after="80"/>
+        <w:ind w:left="360"/>
+      </w:pPr>
+      <w:r>
+        <w:rPr>
+          <w:sz w:val="21"/>
+        </w:rPr>
+        <w:t>Leveraging 15+ years of elite experience to deliver strategic project execution and digital transformation frameworks for clients across highly regulated and mission-critical industries.</w:t>
       </w:r>
     </w:p>
     <w:p>

</xml_diff>